<commit_message>
Clarify CMD-based download and installation
</commit_message>
<xml_diff>
--- a/llm_clipboard_production_repo/docs/user-guide/Privacify_User_Install_Guide.docx
+++ b/llm_clipboard_production_repo/docs/user-guide/Privacify_User_Install_Guide.docx
@@ -282,7 +282,7 @@
         <w:spacing w:after="60"/>
       </w:pPr>
       <w:r>
-        <w:t>Download or unzip the Privacify Windows package.</w:t>
+        <w:t>Go to https://github.com/pruthvishp/privacify. Click Code, then select Download ZIP.</w:t>
       </w:r>
     </w:p>
     <w:p>
@@ -291,7 +291,7 @@
         <w:spacing w:after="60"/>
       </w:pPr>
       <w:r>
-        <w:t>Double-click Install Privacify.cmd.</w:t>
+        <w:t>Extract the downloaded ZIP and open the llm_clipboard_production_repo folder.</w:t>
       </w:r>
     </w:p>
     <w:p>
@@ -300,7 +300,7 @@
         <w:spacing w:after="60"/>
       </w:pPr>
       <w:r>
-        <w:t>Open Privacify Manager from the desktop shortcut or http://127.0.0.1:8787/.</w:t>
+        <w:t>Double-click Install Privacify.cmd. Keep the installer window open until it reports that installation is complete; the first install downloads local runtimes and a model, so it can take several minutes.</w:t>
       </w:r>
     </w:p>
     <w:p>
@@ -309,7 +309,7 @@
         <w:spacing w:after="60"/>
       </w:pPr>
       <w:r>
-        <w:t>Copy sensitive text from any app, press Ctrl+Alt+4, then paste the redacted output after the ready signal.</w:t>
+        <w:t>Use the Privacify Manager desktop shortcut for settings. To redact text, copy it, press Ctrl+Alt+4, wait for the ready signal, then paste the result.</w:t>
       </w:r>
     </w:p>
     <w:p>
@@ -722,50 +722,6 @@
       </w:tr>
     </w:tbl>
     <w:p/>
-    <w:p>
-      <w:pPr>
-        <w:pStyle w:val="Heading1"/>
-      </w:pPr>
-      <w:r>
-        <w:t>One-Click Install Checklist</w:t>
-      </w:r>
-    </w:p>
-    <w:p>
-      <w:pPr>
-        <w:pStyle w:val="ListBullet"/>
-        <w:spacing w:after="60"/>
-      </w:pPr>
-      <w:r>
-        <w:t>Create a GitHub Release with Privacify-Windows.zip.</w:t>
-      </w:r>
-    </w:p>
-    <w:p>
-      <w:pPr>
-        <w:pStyle w:val="ListBullet"/>
-        <w:spacing w:after="60"/>
-      </w:pPr>
-      <w:r>
-        <w:t>Zip should contain Install Privacify.cmd, install.ps1, README.md, and src/.</w:t>
-      </w:r>
-    </w:p>
-    <w:p>
-      <w:pPr>
-        <w:pStyle w:val="ListBullet"/>
-        <w:spacing w:after="60"/>
-      </w:pPr>
-      <w:r>
-        <w:t>README should say: unzip, double-click Install Privacify.cmd, use Ctrl+Alt+4, manage at http://127.0.0.1:8787/.</w:t>
-      </w:r>
-    </w:p>
-    <w:p>
-      <w:pPr>
-        <w:pStyle w:val="ListBullet"/>
-        <w:spacing w:after="60"/>
-      </w:pPr>
-      <w:r>
-        <w:t>The installer should avoid requiring users to install Node manually; the current script bundles Node into the install directory.</w:t>
-      </w:r>
-    </w:p>
     <w:sectPr>
       <w:footerReference w:type="default" r:id="rId14"/>
       <w:pgSz w:w="12240" w:h="15840"/>

</xml_diff>

<commit_message>
Document evaluation workflow and local timing
</commit_message>
<xml_diff>
--- a/llm_clipboard_production_repo/docs/user-guide/Privacify_User_Install_Guide.docx
+++ b/llm_clipboard_production_repo/docs/user-guide/Privacify_User_Install_Guide.docx
@@ -376,12 +376,13 @@
         <w:pStyle w:val="Heading1"/>
       </w:pPr>
       <w:r>
-        <w:t>UI Surface</w:t>
+        <w:t>Manager Overview</w:t>
       </w:r>
     </w:p>
     <w:p>
+      <w:pPr/>
       <w:r>
-        <w:t>The UI is intentionally not just a demo box. It exposes the controls a user will actually need after install: hotkeys, prompts, examples, model selection, and test runs.</w:t>
+        <w:t>Privacify Manager is the local control surface for models, prompts, examples, hotkeys, testing, and logs.</w:t>
       </w:r>
     </w:p>
     <w:tbl>
@@ -722,6 +723,115 @@
       </w:tr>
     </w:tbl>
     <w:p/>
+    <w:p/>
+    <w:p>
+      <w:pPr>
+        <w:pStyle w:val="Heading1"/>
+      </w:pPr>
+      <w:r>
+        <w:t>UI Features</w:t>
+      </w:r>
+    </w:p>
+    <w:p>
+      <w:pPr>
+        <w:pStyle w:val="ListBullet"/>
+      </w:pPr>
+      <w:r>
+        <w:t>Overview: choose a local model, view the Ollama address, enable or disable the model-assisted Privacify step, and save settings.</w:t>
+      </w:r>
+    </w:p>
+    <w:p>
+      <w:pPr>
+        <w:pStyle w:val="ListBullet"/>
+      </w:pPr>
+      <w:r>
+        <w:t>Hotkeys and Prompts: change the shortcuts or the instructions behind rewrite, summarize, bullets, and Privacify.</w:t>
+      </w:r>
+    </w:p>
+    <w:p>
+      <w:pPr>
+        <w:pStyle w:val="ListBullet"/>
+      </w:pPr>
+      <w:r>
+        <w:t>Examples: enable or disable example context, choose how many examples are used per run, add a category plus input/output pair, and save the examples file.</w:t>
+      </w:r>
+    </w:p>
+    <w:p>
+      <w:pPr>
+        <w:pStyle w:val="ListBullet"/>
+      </w:pPr>
+      <w:r>
+        <w:t>Test: paste representative text, run a Privacify test, and inspect the redacted output before using the hotkey in another app.</w:t>
+      </w:r>
+    </w:p>
+    <w:p>
+      <w:pPr>
+        <w:pStyle w:val="ListBullet"/>
+      </w:pPr>
+      <w:r>
+        <w:t>Logs: inspect recent local debug entries when a run fails or takes longer than expected.</w:t>
+      </w:r>
+    </w:p>
+    <w:p>
+      <w:pPr>
+        <w:pStyle w:val="Heading1"/>
+      </w:pPr>
+      <w:r>
+        <w:t>Test and Improve Results</w:t>
+      </w:r>
+    </w:p>
+    <w:p>
+      <w:pPr>
+        <w:pStyle w:val="ListNumber"/>
+      </w:pPr>
+      <w:r>
+        <w:t>Open the Test tab, paste a representative case, and run Privacify. Use synthetic data whenever possible.</w:t>
+      </w:r>
+    </w:p>
+    <w:p>
+      <w:pPr>
+        <w:pStyle w:val="ListNumber"/>
+      </w:pPr>
+      <w:r>
+        <w:t>Compare the output with the redaction you expect. Record patterns that need a more consistent result.</w:t>
+      </w:r>
+    </w:p>
+    <w:p>
+      <w:pPr>
+        <w:pStyle w:val="ListNumber"/>
+      </w:pPr>
+      <w:r>
+        <w:t>Open the Examples tab. Add an input/output pair that demonstrates the desired redaction, then select Save examples.</w:t>
+      </w:r>
+    </w:p>
+    <w:p>
+      <w:pPr>
+        <w:pStyle w:val="ListNumber"/>
+      </w:pPr>
+      <w:r>
+        <w:t>Rerun the same test. Add examples gradually and keep the most relevant ones enabled.</w:t>
+      </w:r>
+    </w:p>
+    <w:p>
+      <w:pPr/>
+      <w:r>
+        <w:t>Examples are runtime context, not model fine-tuning. The selected examples are added to the local model prompt for each Privacify run. They can improve consistency for your patterns, but more examples also add prompt size and can increase latency.</w:t>
+      </w:r>
+    </w:p>
+    <w:p>
+      <w:pPr>
+        <w:pStyle w:val="Heading1"/>
+      </w:pPr>
+      <w:r>
+        <w:t>Expected Timing</w:t>
+      </w:r>
+    </w:p>
+    <w:p>
+      <w:pPr/>
+      <w:r>
+        <w:t>On the current local setup, a model-assisted redaction can take about 45-60 seconds. Timing depends on the selected model, machine resources, input size, and enabled examples. The first model download is also much longer because it downloads the model itself.</w:t>
+      </w:r>
+    </w:p>
     <w:sectPr>
       <w:footerReference w:type="default" r:id="rId14"/>
       <w:pgSz w:w="12240" w:h="15840"/>

</xml_diff>